<commit_message>
feat: add production deployment config with TLS
- docker-compose.prod.yml: nginx + certbot + 4 services (web/api-gateway/core-svc/ai-svc)
- nginx.prod.conf: TLS termination, /gw/* → api-gateway, /* → web
- init-letsencrypt.sh: automated Let's Encrypt cert provisioning
- web Dockerfile: bake NEXT_PUBLIC_API_URL at build time
- Target: govtrust.site with Let's Encrypt TLS

Co-Authored-By: Claude Opus 4.8 (1M context) <noreply@anthropic.com>
</commit_message>
<xml_diff>
--- a/template/renderable/HKD_THAY_DOI.docx
+++ b/template/renderable/HKD_THAY_DOI.docx
@@ -1052,32 +1052,32 @@
           <w:szCs w:val="24"/>
           <w14:ligatures w14:val="none"/>
         </w:rPr>
-        <w:t>): ...............................................  Giới tính: ....................</w:t>
-      </w:r>
-    </w:p>
-    <w:p>
-      <w:pPr>
-        <w:shd w:val="clear" w:color="auto" w:fill="FFFFFF"/>
-        <w:spacing w:before="120" w:line="234" w:lineRule="atLeast"/>
-        <w:rPr>
-          <w:rFonts w:ascii="Times New Roman" w:eastAsia="Times New Roman" w:hAnsi="Times New Roman" w:cs="Times New Roman"/>
-          <w:color w:val="000000"/>
-          <w:kern w:val="0"/>
-          <w:sz w:val="24"/>
-          <w:szCs w:val="24"/>
-          <w14:ligatures w14:val="none"/>
-        </w:rPr>
-      </w:pPr>
-      <w:r>
-        <w:rPr>
-          <w:rFonts w:ascii="Times New Roman" w:eastAsia="Times New Roman" w:hAnsi="Times New Roman" w:cs="Times New Roman"/>
-          <w:color w:val="000000"/>
-          <w:kern w:val="0"/>
-          <w:sz w:val="24"/>
-          <w:szCs w:val="24"/>
-          <w14:ligatures w14:val="none"/>
-        </w:rPr>
-        <w:t>Sinh ngày: ........./....../........ Dân tộc: ......  Quốc tịch: ....................</w:t>
+        <w:t>): {{chuHoCu.hoTen}}  Giới tính: {{chuHoCu.gioiTinh}}</w:t>
+      </w:r>
+    </w:p>
+    <w:p>
+      <w:pPr>
+        <w:shd w:val="clear" w:color="auto" w:fill="FFFFFF"/>
+        <w:spacing w:before="120" w:line="234" w:lineRule="atLeast"/>
+        <w:rPr>
+          <w:rFonts w:ascii="Times New Roman" w:eastAsia="Times New Roman" w:hAnsi="Times New Roman" w:cs="Times New Roman"/>
+          <w:color w:val="000000"/>
+          <w:kern w:val="0"/>
+          <w:sz w:val="24"/>
+          <w:szCs w:val="24"/>
+          <w14:ligatures w14:val="none"/>
+        </w:rPr>
+      </w:pPr>
+      <w:r>
+        <w:rPr>
+          <w:rFonts w:ascii="Times New Roman" w:eastAsia="Times New Roman" w:hAnsi="Times New Roman" w:cs="Times New Roman"/>
+          <w:color w:val="000000"/>
+          <w:kern w:val="0"/>
+          <w:sz w:val="24"/>
+          <w:szCs w:val="24"/>
+          <w14:ligatures w14:val="none"/>
+        </w:rPr>
+        <w:t>Sinh ngày: {{chuHoCu.ngaySinh}} Dân tộc: {{chuHoCu.danToc}}  Quốc tịch: {{chuHoCu.quocTich}}</w:t>
       </w:r>
     </w:p>
     <w:p>
@@ -1690,32 +1690,32 @@
           <w:szCs w:val="24"/>
           <w14:ligatures w14:val="none"/>
         </w:rPr>
-        <w:t>): .....................................................  Giới tính: ……….</w:t>
-      </w:r>
-    </w:p>
-    <w:p>
-      <w:pPr>
-        <w:shd w:val="clear" w:color="auto" w:fill="FFFFFF"/>
-        <w:spacing w:before="120" w:line="234" w:lineRule="atLeast"/>
-        <w:rPr>
-          <w:rFonts w:ascii="Times New Roman" w:eastAsia="Times New Roman" w:hAnsi="Times New Roman" w:cs="Times New Roman"/>
-          <w:color w:val="000000"/>
-          <w:kern w:val="0"/>
-          <w:sz w:val="24"/>
-          <w:szCs w:val="24"/>
-          <w14:ligatures w14:val="none"/>
-        </w:rPr>
-      </w:pPr>
-      <w:r>
-        <w:rPr>
-          <w:rFonts w:ascii="Times New Roman" w:eastAsia="Times New Roman" w:hAnsi="Times New Roman" w:cs="Times New Roman"/>
-          <w:color w:val="000000"/>
-          <w:kern w:val="0"/>
-          <w:sz w:val="24"/>
-          <w:szCs w:val="24"/>
-          <w14:ligatures w14:val="none"/>
-        </w:rPr>
-        <w:t>Sinh ngày: ................ /............... /........... Dân tộc: ........................  Quốc tịch: ............</w:t>
+        <w:t>): {{chuHoMoi.hoTen}}  Giới tính: {{chuHoMoi.gioiTinh}}</w:t>
+      </w:r>
+    </w:p>
+    <w:p>
+      <w:pPr>
+        <w:shd w:val="clear" w:color="auto" w:fill="FFFFFF"/>
+        <w:spacing w:before="120" w:line="234" w:lineRule="atLeast"/>
+        <w:rPr>
+          <w:rFonts w:ascii="Times New Roman" w:eastAsia="Times New Roman" w:hAnsi="Times New Roman" w:cs="Times New Roman"/>
+          <w:color w:val="000000"/>
+          <w:kern w:val="0"/>
+          <w:sz w:val="24"/>
+          <w:szCs w:val="24"/>
+          <w14:ligatures w14:val="none"/>
+        </w:rPr>
+      </w:pPr>
+      <w:r>
+        <w:rPr>
+          <w:rFonts w:ascii="Times New Roman" w:eastAsia="Times New Roman" w:hAnsi="Times New Roman" w:cs="Times New Roman"/>
+          <w:color w:val="000000"/>
+          <w:kern w:val="0"/>
+          <w:sz w:val="24"/>
+          <w:szCs w:val="24"/>
+          <w14:ligatures w14:val="none"/>
+        </w:rPr>
+        <w:t>Sinh ngày: {{chuHoMoi.ngaySinh}} Dân tộc: {{chuHoMoi.danToc}}  Quốc tịch: {{chuHoMoi.quocTich}}</w:t>
       </w:r>
     </w:p>
     <w:p>
@@ -1910,7 +1910,7 @@
         </w:rPr>
       </w:pPr>
       <w:r>
-        <w:t>Số giấy tờ pháp lý của cá nhân: {{chuHoCu.soCCCD}}</w:t>
+        <w:t>Số giấy tờ pháp lý của cá nhân: {{chuHoMoi.soCCCD}}</w:t>
       </w:r>
     </w:p>
     <w:p>
@@ -1976,7 +1976,7 @@
         </w:rPr>
       </w:pPr>
       <w:r>
-        <w:t>Có giá trị đến ngày: {{chuHoCu.hanSuDung}}</w:t>
+        <w:t>Có giá trị đến ngày: {{chuHoMoi.hanSuDung}}</w:t>
       </w:r>
     </w:p>
     <w:p>
@@ -2018,58 +2018,58 @@
         </w:rPr>
       </w:pPr>
       <w:r>
-        <w:t>Số nhà, ngách, hẻm, ngõ, đường phố/tổ/xóm/ấp/thôn: {{diaChiThuongTru.soNha}}</w:t>
-      </w:r>
-    </w:p>
-    <w:p>
-      <w:pPr>
-        <w:shd w:val="clear" w:color="auto" w:fill="FFFFFF"/>
-        <w:spacing w:before="120" w:line="234" w:lineRule="atLeast"/>
-        <w:rPr>
-          <w:rFonts w:ascii="Times New Roman" w:eastAsia="Times New Roman" w:hAnsi="Times New Roman" w:cs="Times New Roman"/>
-          <w:color w:val="000000"/>
-          <w:kern w:val="0"/>
-          <w:sz w:val="24"/>
-          <w:szCs w:val="24"/>
-          <w14:ligatures w14:val="none"/>
-        </w:rPr>
-      </w:pPr>
-      <w:r>
-        <w:t>Xã/Phường/Thị trấn: {{diaChiThuongTru.xaPhuong}}</w:t>
-      </w:r>
-    </w:p>
-    <w:p>
-      <w:pPr>
-        <w:shd w:val="clear" w:color="auto" w:fill="FFFFFF"/>
-        <w:spacing w:before="120" w:line="234" w:lineRule="atLeast"/>
-        <w:rPr>
-          <w:rFonts w:ascii="Times New Roman" w:eastAsia="Times New Roman" w:hAnsi="Times New Roman" w:cs="Times New Roman"/>
-          <w:color w:val="000000"/>
-          <w:kern w:val="0"/>
-          <w:sz w:val="24"/>
-          <w:szCs w:val="24"/>
-          <w14:ligatures w14:val="none"/>
-        </w:rPr>
-      </w:pPr>
-      <w:r>
-        <w:t>Quận/Huyện/Thị xã/Thành phố thuộc tỉnh: {{diaChiThuongTru.quanHuyen}}</w:t>
-      </w:r>
-    </w:p>
-    <w:p>
-      <w:pPr>
-        <w:shd w:val="clear" w:color="auto" w:fill="FFFFFF"/>
-        <w:spacing w:before="120" w:line="234" w:lineRule="atLeast"/>
-        <w:rPr>
-          <w:rFonts w:ascii="Times New Roman" w:eastAsia="Times New Roman" w:hAnsi="Times New Roman" w:cs="Times New Roman"/>
-          <w:color w:val="000000"/>
-          <w:kern w:val="0"/>
-          <w:sz w:val="24"/>
-          <w:szCs w:val="24"/>
-          <w14:ligatures w14:val="none"/>
-        </w:rPr>
-      </w:pPr>
-      <w:r>
-        <w:t>Tỉnh/Thành phố: {{diaChiThuongTru.tinhThanh}}</w:t>
+        <w:t>Số nhà, ngách, hẻm, ngõ, đường phố/tổ/xóm/ấp/thôn: {{diaChiThuongTruMoi.soNha}}</w:t>
+      </w:r>
+    </w:p>
+    <w:p>
+      <w:pPr>
+        <w:shd w:val="clear" w:color="auto" w:fill="FFFFFF"/>
+        <w:spacing w:before="120" w:line="234" w:lineRule="atLeast"/>
+        <w:rPr>
+          <w:rFonts w:ascii="Times New Roman" w:eastAsia="Times New Roman" w:hAnsi="Times New Roman" w:cs="Times New Roman"/>
+          <w:color w:val="000000"/>
+          <w:kern w:val="0"/>
+          <w:sz w:val="24"/>
+          <w:szCs w:val="24"/>
+          <w14:ligatures w14:val="none"/>
+        </w:rPr>
+      </w:pPr>
+      <w:r>
+        <w:t>Xã/Phường/Thị trấn: {{diaChiThuongTruMoi.xaPhuong}}</w:t>
+      </w:r>
+    </w:p>
+    <w:p>
+      <w:pPr>
+        <w:shd w:val="clear" w:color="auto" w:fill="FFFFFF"/>
+        <w:spacing w:before="120" w:line="234" w:lineRule="atLeast"/>
+        <w:rPr>
+          <w:rFonts w:ascii="Times New Roman" w:eastAsia="Times New Roman" w:hAnsi="Times New Roman" w:cs="Times New Roman"/>
+          <w:color w:val="000000"/>
+          <w:kern w:val="0"/>
+          <w:sz w:val="24"/>
+          <w:szCs w:val="24"/>
+          <w14:ligatures w14:val="none"/>
+        </w:rPr>
+      </w:pPr>
+      <w:r>
+        <w:t>Quận/Huyện/Thị xã/Thành phố thuộc tỉnh: {{diaChiThuongTruMoi.quanHuyen}}</w:t>
+      </w:r>
+    </w:p>
+    <w:p>
+      <w:pPr>
+        <w:shd w:val="clear" w:color="auto" w:fill="FFFFFF"/>
+        <w:spacing w:before="120" w:line="234" w:lineRule="atLeast"/>
+        <w:rPr>
+          <w:rFonts w:ascii="Times New Roman" w:eastAsia="Times New Roman" w:hAnsi="Times New Roman" w:cs="Times New Roman"/>
+          <w:color w:val="000000"/>
+          <w:kern w:val="0"/>
+          <w:sz w:val="24"/>
+          <w:szCs w:val="24"/>
+          <w14:ligatures w14:val="none"/>
+        </w:rPr>
+      </w:pPr>
+      <w:r>
+        <w:t>Tỉnh/Thành phố: {{diaChiThuongTruMoi.tinhThanh}}</w:t>
       </w:r>
     </w:p>
     <w:p>
@@ -2111,58 +2111,58 @@
         </w:rPr>
       </w:pPr>
       <w:r>
-        <w:t>Số nhà, ngách, hẻm, ngõ, đường phố/tổ/xóm/ấp/thôn: {{diaChiThuongTru.soNha}}</w:t>
-      </w:r>
-    </w:p>
-    <w:p>
-      <w:pPr>
-        <w:shd w:val="clear" w:color="auto" w:fill="FFFFFF"/>
-        <w:spacing w:before="120" w:line="234" w:lineRule="atLeast"/>
-        <w:rPr>
-          <w:rFonts w:ascii="Times New Roman" w:eastAsia="Times New Roman" w:hAnsi="Times New Roman" w:cs="Times New Roman"/>
-          <w:color w:val="000000"/>
-          <w:kern w:val="0"/>
-          <w:sz w:val="24"/>
-          <w:szCs w:val="24"/>
-          <w14:ligatures w14:val="none"/>
-        </w:rPr>
-      </w:pPr>
-      <w:r>
-        <w:t>Xã/Phường/Thị trấn: {{diaChiThuongTru.xaPhuong}}</w:t>
-      </w:r>
-    </w:p>
-    <w:p>
-      <w:pPr>
-        <w:shd w:val="clear" w:color="auto" w:fill="FFFFFF"/>
-        <w:spacing w:before="120" w:line="234" w:lineRule="atLeast"/>
-        <w:rPr>
-          <w:rFonts w:ascii="Times New Roman" w:eastAsia="Times New Roman" w:hAnsi="Times New Roman" w:cs="Times New Roman"/>
-          <w:color w:val="000000"/>
-          <w:kern w:val="0"/>
-          <w:sz w:val="24"/>
-          <w:szCs w:val="24"/>
-          <w14:ligatures w14:val="none"/>
-        </w:rPr>
-      </w:pPr>
-      <w:r>
-        <w:t>Quận/Huyện/Thị xã/Thành phố thuộc tỉnh: {{diaChiThuongTru.quanHuyen}}</w:t>
-      </w:r>
-    </w:p>
-    <w:p>
-      <w:pPr>
-        <w:shd w:val="clear" w:color="auto" w:fill="FFFFFF"/>
-        <w:spacing w:before="120" w:line="234" w:lineRule="atLeast"/>
-        <w:rPr>
-          <w:rFonts w:ascii="Times New Roman" w:eastAsia="Times New Roman" w:hAnsi="Times New Roman" w:cs="Times New Roman"/>
-          <w:color w:val="000000"/>
-          <w:kern w:val="0"/>
-          <w:sz w:val="24"/>
-          <w:szCs w:val="24"/>
-          <w14:ligatures w14:val="none"/>
-        </w:rPr>
-      </w:pPr>
-      <w:r>
-        <w:t>Tỉnh/Thành phố: {{diaChiThuongTru.tinhThanh}}</w:t>
+        <w:t>Số nhà, ngách, hẻm, ngõ, đường phố/tổ/xóm/ấp/thôn: {{diaChiThuongTruMoi.soNha}}</w:t>
+      </w:r>
+    </w:p>
+    <w:p>
+      <w:pPr>
+        <w:shd w:val="clear" w:color="auto" w:fill="FFFFFF"/>
+        <w:spacing w:before="120" w:line="234" w:lineRule="atLeast"/>
+        <w:rPr>
+          <w:rFonts w:ascii="Times New Roman" w:eastAsia="Times New Roman" w:hAnsi="Times New Roman" w:cs="Times New Roman"/>
+          <w:color w:val="000000"/>
+          <w:kern w:val="0"/>
+          <w:sz w:val="24"/>
+          <w:szCs w:val="24"/>
+          <w14:ligatures w14:val="none"/>
+        </w:rPr>
+      </w:pPr>
+      <w:r>
+        <w:t>Xã/Phường/Thị trấn: {{diaChiThuongTruMoi.xaPhuong}}</w:t>
+      </w:r>
+    </w:p>
+    <w:p>
+      <w:pPr>
+        <w:shd w:val="clear" w:color="auto" w:fill="FFFFFF"/>
+        <w:spacing w:before="120" w:line="234" w:lineRule="atLeast"/>
+        <w:rPr>
+          <w:rFonts w:ascii="Times New Roman" w:eastAsia="Times New Roman" w:hAnsi="Times New Roman" w:cs="Times New Roman"/>
+          <w:color w:val="000000"/>
+          <w:kern w:val="0"/>
+          <w:sz w:val="24"/>
+          <w:szCs w:val="24"/>
+          <w14:ligatures w14:val="none"/>
+        </w:rPr>
+      </w:pPr>
+      <w:r>
+        <w:t>Quận/Huyện/Thị xã/Thành phố thuộc tỉnh: {{diaChiThuongTruMoi.quanHuyen}}</w:t>
+      </w:r>
+    </w:p>
+    <w:p>
+      <w:pPr>
+        <w:shd w:val="clear" w:color="auto" w:fill="FFFFFF"/>
+        <w:spacing w:before="120" w:line="234" w:lineRule="atLeast"/>
+        <w:rPr>
+          <w:rFonts w:ascii="Times New Roman" w:eastAsia="Times New Roman" w:hAnsi="Times New Roman" w:cs="Times New Roman"/>
+          <w:color w:val="000000"/>
+          <w:kern w:val="0"/>
+          <w:sz w:val="24"/>
+          <w:szCs w:val="24"/>
+          <w14:ligatures w14:val="none"/>
+        </w:rPr>
+      </w:pPr>
+      <w:r>
+        <w:t>Tỉnh/Thành phố: {{diaChiThuongTruMoi.tinhThanh}}</w:t>
       </w:r>
     </w:p>
     <w:p>

</xml_diff>